<commit_message>
Actualización Plantilla CS y 1a CS
</commit_message>
<xml_diff>
--- a/customer-stories/plantilla_customer_stories.docx
+++ b/customer-stories/plantilla_customer_stories.docx
@@ -88,7 +88,6 @@
                 <w:showingPlcHdr/>
                 <w:text/>
               </w:sdtPr>
-              <w:sdtEndPr/>
               <w:sdtContent>
                 <w:r>
                   <w:rPr>
@@ -136,7 +135,6 @@
                 <w:showingPlcHdr/>
                 <w:text/>
               </w:sdtPr>
-              <w:sdtEndPr/>
               <w:sdtContent>
                 <w:r>
                   <w:rPr>
@@ -184,7 +182,6 @@
                 <w:showingPlcHdr/>
                 <w:text/>
               </w:sdtPr>
-              <w:sdtEndPr/>
               <w:sdtContent>
                 <w:r>
                   <w:rPr>
@@ -262,7 +259,6 @@
                 <w:showingPlcHdr/>
                 <w:text/>
               </w:sdtPr>
-              <w:sdtEndPr/>
               <w:sdtContent>
                 <w:r>
                   <w:rPr>
@@ -311,7 +307,6 @@
                 <w:showingPlcHdr/>
                 <w:text/>
               </w:sdtPr>
-              <w:sdtEndPr/>
               <w:sdtContent>
                 <w:r>
                   <w:rPr>
@@ -360,7 +355,6 @@
                 <w:showingPlcHdr/>
                 <w:text/>
               </w:sdtPr>
-              <w:sdtEndPr/>
               <w:sdtContent>
                 <w:r>
                   <w:rPr>
@@ -409,7 +403,6 @@
                 <w:showingPlcHdr/>
                 <w:text/>
               </w:sdtPr>
-              <w:sdtEndPr/>
               <w:sdtContent>
                 <w:r>
                   <w:rPr>
@@ -462,7 +455,6 @@
                 <w:showingPlcHdr/>
                 <w:text/>
               </w:sdtPr>
-              <w:sdtEndPr/>
               <w:sdtContent>
                 <w:r>
                   <w:rPr>
@@ -511,7 +503,6 @@
                 <w:showingPlcHdr/>
                 <w:text/>
               </w:sdtPr>
-              <w:sdtEndPr/>
               <w:sdtContent>
                 <w:r>
                   <w:rPr>
@@ -560,7 +551,6 @@
                 <w:showingPlcHdr/>
                 <w:text/>
               </w:sdtPr>
-              <w:sdtEndPr/>
               <w:sdtContent>
                 <w:r>
                   <w:rPr>
@@ -594,7 +584,6 @@
                 <w:showingPlcHdr/>
                 <w:text/>
               </w:sdtPr>
-              <w:sdtEndPr/>
               <w:sdtContent>
                 <w:r>
                   <w:rPr>
@@ -645,7 +634,6 @@
                 <w:showingPlcHdr/>
                 <w:text/>
               </w:sdtPr>
-              <w:sdtEndPr/>
               <w:sdtContent>
                 <w:r>
                   <w:rPr>
@@ -694,7 +682,6 @@
                 <w:showingPlcHdr/>
                 <w:text/>
               </w:sdtPr>
-              <w:sdtEndPr/>
               <w:sdtContent>
                 <w:r>
                   <w:rPr>
@@ -745,7 +732,6 @@
                 <w:showingPlcHdr/>
                 <w:text w:multiLine="1"/>
               </w:sdtPr>
-              <w:sdtEndPr/>
               <w:sdtContent>
                 <w:r>
                   <w:rPr>
@@ -786,7 +772,15 @@
                 <w:b/>
                 <w:color w:val="000000"/>
               </w:rPr>
-              <w:t>NOTES:</w:t>
+              <w:t>VALIDATION CRITERIA</w:t>
+            </w:r>
+            <w:r>
+              <w:rPr>
+                <w:rFonts w:eastAsia="Times New Roman" w:cs="Times New Roman"/>
+                <w:b/>
+                <w:color w:val="000000"/>
+              </w:rPr>
+              <w:t>:</w:t>
             </w:r>
           </w:p>
           <w:p>
@@ -810,7 +804,6 @@
                 <w:showingPlcHdr/>
                 <w:text w:multiLine="1"/>
               </w:sdtPr>
-              <w:sdtEndPr/>
               <w:sdtContent>
                 <w:r>
                   <w:rPr>
@@ -875,7 +868,6 @@
                 <w:showingPlcHdr/>
                 <w:text w:multiLine="1"/>
               </w:sdtPr>
-              <w:sdtEndPr/>
               <w:sdtContent>
                 <w:r>
                   <w:rPr>
@@ -982,7 +974,6 @@
                 <w:showingPlcHdr/>
                 <w:text/>
               </w:sdtPr>
-              <w:sdtEndPr/>
               <w:sdtContent>
                 <w:r>
                   <w:rPr>
@@ -1030,7 +1021,6 @@
                 <w:showingPlcHdr/>
                 <w:text/>
               </w:sdtPr>
-              <w:sdtEndPr/>
               <w:sdtContent>
                 <w:r>
                   <w:rPr>
@@ -1078,7 +1068,6 @@
                 <w:showingPlcHdr/>
                 <w:text/>
               </w:sdtPr>
-              <w:sdtEndPr/>
               <w:sdtContent>
                 <w:r>
                   <w:rPr>
@@ -1156,7 +1145,6 @@
                 <w:showingPlcHdr/>
                 <w:text/>
               </w:sdtPr>
-              <w:sdtEndPr/>
               <w:sdtContent>
                 <w:r>
                   <w:rPr>
@@ -1205,7 +1193,6 @@
                 <w:showingPlcHdr/>
                 <w:text/>
               </w:sdtPr>
-              <w:sdtEndPr/>
               <w:sdtContent>
                 <w:r>
                   <w:rPr>
@@ -1254,7 +1241,6 @@
                 <w:showingPlcHdr/>
                 <w:text/>
               </w:sdtPr>
-              <w:sdtEndPr/>
               <w:sdtContent>
                 <w:r>
                   <w:rPr>
@@ -1303,7 +1289,6 @@
                 <w:showingPlcHdr/>
                 <w:text/>
               </w:sdtPr>
-              <w:sdtEndPr/>
               <w:sdtContent>
                 <w:r>
                   <w:rPr>
@@ -1356,7 +1341,6 @@
                 <w:showingPlcHdr/>
                 <w:text/>
               </w:sdtPr>
-              <w:sdtEndPr/>
               <w:sdtContent>
                 <w:r>
                   <w:rPr>
@@ -1405,7 +1389,6 @@
                 <w:showingPlcHdr/>
                 <w:text/>
               </w:sdtPr>
-              <w:sdtEndPr/>
               <w:sdtContent>
                 <w:r>
                   <w:rPr>
@@ -1454,7 +1437,6 @@
                 <w:showingPlcHdr/>
                 <w:text/>
               </w:sdtPr>
-              <w:sdtEndPr/>
               <w:sdtContent>
                 <w:r>
                   <w:rPr>
@@ -1488,7 +1470,6 @@
                 <w:showingPlcHdr/>
                 <w:text/>
               </w:sdtPr>
-              <w:sdtEndPr/>
               <w:sdtContent>
                 <w:r>
                   <w:rPr>
@@ -1539,7 +1520,6 @@
                 <w:showingPlcHdr/>
                 <w:text/>
               </w:sdtPr>
-              <w:sdtEndPr/>
               <w:sdtContent>
                 <w:r>
                   <w:rPr>
@@ -1588,7 +1568,6 @@
                 <w:showingPlcHdr/>
                 <w:text/>
               </w:sdtPr>
-              <w:sdtEndPr/>
               <w:sdtContent>
                 <w:r>
                   <w:rPr>
@@ -1639,7 +1618,6 @@
                 <w:showingPlcHdr/>
                 <w:text w:multiLine="1"/>
               </w:sdtPr>
-              <w:sdtEndPr/>
               <w:sdtContent>
                 <w:r>
                   <w:rPr>
@@ -1680,7 +1658,15 @@
                 <w:b/>
                 <w:color w:val="000000"/>
               </w:rPr>
-              <w:t>NOTES:</w:t>
+              <w:t>VALIDATION CRITERIA</w:t>
+            </w:r>
+            <w:r>
+              <w:rPr>
+                <w:rFonts w:eastAsia="Times New Roman" w:cs="Times New Roman"/>
+                <w:b/>
+                <w:color w:val="000000"/>
+              </w:rPr>
+              <w:t>:</w:t>
             </w:r>
           </w:p>
           <w:p>
@@ -1704,7 +1690,6 @@
                 <w:showingPlcHdr/>
                 <w:text w:multiLine="1"/>
               </w:sdtPr>
-              <w:sdtEndPr/>
               <w:sdtContent>
                 <w:r>
                   <w:rPr>
@@ -1769,7 +1754,6 @@
                 <w:showingPlcHdr/>
                 <w:text w:multiLine="1"/>
               </w:sdtPr>
-              <w:sdtEndPr/>
               <w:sdtContent>
                 <w:r>
                   <w:rPr>
@@ -1876,7 +1860,6 @@
                 <w:showingPlcHdr/>
                 <w:text/>
               </w:sdtPr>
-              <w:sdtEndPr/>
               <w:sdtContent>
                 <w:r>
                   <w:rPr>
@@ -1924,7 +1907,6 @@
                 <w:showingPlcHdr/>
                 <w:text/>
               </w:sdtPr>
-              <w:sdtEndPr/>
               <w:sdtContent>
                 <w:r>
                   <w:rPr>
@@ -1972,7 +1954,6 @@
                 <w:showingPlcHdr/>
                 <w:text/>
               </w:sdtPr>
-              <w:sdtEndPr/>
               <w:sdtContent>
                 <w:r>
                   <w:rPr>
@@ -2050,7 +2031,6 @@
                 <w:showingPlcHdr/>
                 <w:text/>
               </w:sdtPr>
-              <w:sdtEndPr/>
               <w:sdtContent>
                 <w:r>
                   <w:rPr>
@@ -2099,7 +2079,6 @@
                 <w:showingPlcHdr/>
                 <w:text/>
               </w:sdtPr>
-              <w:sdtEndPr/>
               <w:sdtContent>
                 <w:r>
                   <w:rPr>
@@ -2148,7 +2127,6 @@
                 <w:showingPlcHdr/>
                 <w:text/>
               </w:sdtPr>
-              <w:sdtEndPr/>
               <w:sdtContent>
                 <w:r>
                   <w:rPr>
@@ -2197,7 +2175,6 @@
                 <w:showingPlcHdr/>
                 <w:text/>
               </w:sdtPr>
-              <w:sdtEndPr/>
               <w:sdtContent>
                 <w:r>
                   <w:rPr>
@@ -2250,7 +2227,6 @@
                 <w:showingPlcHdr/>
                 <w:text/>
               </w:sdtPr>
-              <w:sdtEndPr/>
               <w:sdtContent>
                 <w:r>
                   <w:rPr>
@@ -2299,7 +2275,6 @@
                 <w:showingPlcHdr/>
                 <w:text/>
               </w:sdtPr>
-              <w:sdtEndPr/>
               <w:sdtContent>
                 <w:r>
                   <w:rPr>
@@ -2348,7 +2323,6 @@
                 <w:showingPlcHdr/>
                 <w:text/>
               </w:sdtPr>
-              <w:sdtEndPr/>
               <w:sdtContent>
                 <w:r>
                   <w:rPr>
@@ -2382,7 +2356,6 @@
                 <w:showingPlcHdr/>
                 <w:text/>
               </w:sdtPr>
-              <w:sdtEndPr/>
               <w:sdtContent>
                 <w:r>
                   <w:rPr>
@@ -2433,7 +2406,6 @@
                 <w:showingPlcHdr/>
                 <w:text/>
               </w:sdtPr>
-              <w:sdtEndPr/>
               <w:sdtContent>
                 <w:r>
                   <w:rPr>
@@ -2482,7 +2454,6 @@
                 <w:showingPlcHdr/>
                 <w:text/>
               </w:sdtPr>
-              <w:sdtEndPr/>
               <w:sdtContent>
                 <w:r>
                   <w:rPr>
@@ -2533,7 +2504,6 @@
                 <w:showingPlcHdr/>
                 <w:text w:multiLine="1"/>
               </w:sdtPr>
-              <w:sdtEndPr/>
               <w:sdtContent>
                 <w:r>
                   <w:rPr>
@@ -2574,7 +2544,15 @@
                 <w:b/>
                 <w:color w:val="000000"/>
               </w:rPr>
-              <w:t>NOTES:</w:t>
+              <w:t>VALIDATION CRITERIA</w:t>
+            </w:r>
+            <w:r>
+              <w:rPr>
+                <w:rFonts w:eastAsia="Times New Roman" w:cs="Times New Roman"/>
+                <w:b/>
+                <w:color w:val="000000"/>
+              </w:rPr>
+              <w:t>:</w:t>
             </w:r>
           </w:p>
           <w:p>
@@ -2598,7 +2576,6 @@
                 <w:showingPlcHdr/>
                 <w:text w:multiLine="1"/>
               </w:sdtPr>
-              <w:sdtEndPr/>
               <w:sdtContent>
                 <w:r>
                   <w:rPr>
@@ -2663,7 +2640,6 @@
                 <w:showingPlcHdr/>
                 <w:text w:multiLine="1"/>
               </w:sdtPr>
-              <w:sdtEndPr/>
               <w:sdtContent>
                 <w:r>
                   <w:rPr>
@@ -2866,31 +2842,31 @@
       </w:rPr>
     </w:lvl>
   </w:abstractNum>
-  <w:num w:numId="1" w16cid:durableId="594244759">
+  <w:num w:numId="1" w16cid:durableId="1851142323">
     <w:abstractNumId w:val="8"/>
   </w:num>
-  <w:num w:numId="2" w16cid:durableId="898057946">
+  <w:num w:numId="2" w16cid:durableId="810294806">
     <w:abstractNumId w:val="6"/>
   </w:num>
-  <w:num w:numId="3" w16cid:durableId="4793880">
+  <w:num w:numId="3" w16cid:durableId="282151526">
     <w:abstractNumId w:val="5"/>
   </w:num>
-  <w:num w:numId="4" w16cid:durableId="460422950">
+  <w:num w:numId="4" w16cid:durableId="1954707772">
     <w:abstractNumId w:val="4"/>
   </w:num>
-  <w:num w:numId="5" w16cid:durableId="308098717">
+  <w:num w:numId="5" w16cid:durableId="1382942018">
     <w:abstractNumId w:val="7"/>
   </w:num>
-  <w:num w:numId="6" w16cid:durableId="1602643031">
+  <w:num w:numId="6" w16cid:durableId="1601985070">
     <w:abstractNumId w:val="3"/>
   </w:num>
-  <w:num w:numId="7" w16cid:durableId="560747432">
+  <w:num w:numId="7" w16cid:durableId="498617577">
     <w:abstractNumId w:val="2"/>
   </w:num>
-  <w:num w:numId="8" w16cid:durableId="862062194">
+  <w:num w:numId="8" w16cid:durableId="986209670">
     <w:abstractNumId w:val="1"/>
   </w:num>
-  <w:num w:numId="9" w16cid:durableId="380062081">
+  <w:num w:numId="9" w16cid:durableId="1576620565">
     <w:abstractNumId w:val="0"/>
   </w:num>
 </w:numbering>
@@ -14299,7 +14275,7 @@
         <w:behaviors>
           <w:behavior w:val="content"/>
         </w:behaviors>
-        <w:guid w:val="{B6F53044-9E03-4DF6-B185-AE11F03923A6}"/>
+        <w:guid w:val="{5ACDE4A0-BC04-4009-A827-1F46FF67BD8B}"/>
       </w:docPartPr>
       <w:docPartBody>
         <w:p>
@@ -14325,7 +14301,7 @@
         <w:behaviors>
           <w:behavior w:val="content"/>
         </w:behaviors>
-        <w:guid w:val="{16697308-1CE6-4363-9F48-C9E4ABCE0B94}"/>
+        <w:guid w:val="{EA9EB8E5-FC0B-4C95-9AEF-4CD6934C5293}"/>
       </w:docPartPr>
       <w:docPartBody>
         <w:p>
@@ -14351,7 +14327,7 @@
         <w:behaviors>
           <w:behavior w:val="content"/>
         </w:behaviors>
-        <w:guid w:val="{8B196A56-D103-4876-A242-18462D5A0847}"/>
+        <w:guid w:val="{C72D6AB4-0C7B-425D-A510-18623EB78705}"/>
       </w:docPartPr>
       <w:docPartBody>
         <w:p>
@@ -14377,7 +14353,7 @@
         <w:behaviors>
           <w:behavior w:val="content"/>
         </w:behaviors>
-        <w:guid w:val="{5E1E62BE-8B7B-40CC-8736-1B5CCC93DC2E}"/>
+        <w:guid w:val="{2B29A5B6-4051-4BB4-B641-27CC21961758}"/>
       </w:docPartPr>
       <w:docPartBody>
         <w:p>
@@ -14403,7 +14379,7 @@
         <w:behaviors>
           <w:behavior w:val="content"/>
         </w:behaviors>
-        <w:guid w:val="{0FBFE65F-10F8-4E28-BEDB-5C3AD94AA2F9}"/>
+        <w:guid w:val="{F08AABF6-0FEC-433A-8BF3-D13733AC392D}"/>
       </w:docPartPr>
       <w:docPartBody>
         <w:p>
@@ -14429,7 +14405,7 @@
         <w:behaviors>
           <w:behavior w:val="content"/>
         </w:behaviors>
-        <w:guid w:val="{07BF5BBE-BFD2-4686-8831-AD7A95543F4D}"/>
+        <w:guid w:val="{B54F3A17-35B9-466C-98DA-1FF407BD06ED}"/>
       </w:docPartPr>
       <w:docPartBody>
         <w:p>
@@ -14455,7 +14431,7 @@
         <w:behaviors>
           <w:behavior w:val="content"/>
         </w:behaviors>
-        <w:guid w:val="{C22FC2DF-1B85-4635-B549-722AA0A9BE18}"/>
+        <w:guid w:val="{66B1FC14-8D24-411B-AFEF-10C08EFE6A0C}"/>
       </w:docPartPr>
       <w:docPartBody>
         <w:p>
@@ -14481,7 +14457,7 @@
         <w:behaviors>
           <w:behavior w:val="content"/>
         </w:behaviors>
-        <w:guid w:val="{CB527D13-2357-4F06-839E-413BAEAE4741}"/>
+        <w:guid w:val="{B32D7987-CD8C-4366-8C70-A28E4829426B}"/>
       </w:docPartPr>
       <w:docPartBody>
         <w:p>
@@ -14507,7 +14483,7 @@
         <w:behaviors>
           <w:behavior w:val="content"/>
         </w:behaviors>
-        <w:guid w:val="{1DE6CA7F-479B-4E6B-9D2C-E066DF722311}"/>
+        <w:guid w:val="{860C3759-5CC8-40BB-8C48-3617D0CF589E}"/>
       </w:docPartPr>
       <w:docPartBody>
         <w:p>
@@ -14533,7 +14509,7 @@
         <w:behaviors>
           <w:behavior w:val="content"/>
         </w:behaviors>
-        <w:guid w:val="{ADD1A10F-3C5B-4D99-AE1D-9EABBBFC0E63}"/>
+        <w:guid w:val="{DC2536EE-EB0F-4B00-9DB7-57800E97B4A0}"/>
       </w:docPartPr>
       <w:docPartBody>
         <w:p>
@@ -14559,7 +14535,7 @@
         <w:behaviors>
           <w:behavior w:val="content"/>
         </w:behaviors>
-        <w:guid w:val="{AC560706-A0DC-4F79-BCF6-85856553F3A9}"/>
+        <w:guid w:val="{438A5E03-A86F-43F2-AFE4-CAE714277B62}"/>
       </w:docPartPr>
       <w:docPartBody>
         <w:p>
@@ -14657,10 +14633,10 @@
     <w:compatSetting w:name="useWord2013TrackBottomHyphenation" w:uri="http://schemas.microsoft.com/office/word" w:val="1"/>
   </w:compat>
   <w:rsids>
-    <w:rsidRoot w:val="00C92400"/>
-    <w:rsid w:val="0024191C"/>
-    <w:rsid w:val="00C92400"/>
-    <w:rsid w:val="00D6445C"/>
+    <w:rsidRoot w:val="00024687"/>
+    <w:rsid w:val="00024687"/>
+    <w:rsid w:val="00361FB5"/>
+    <w:rsid w:val="004B0BAC"/>
   </w:rsids>
   <m:mathPr>
     <m:mathFont m:val="Cambria Math"/>

</xml_diff>